<commit_message>
remake Docx Form KFR & Add LibreOfficeService into Public Fun
</commit_message>
<xml_diff>
--- a/public/doc/input/rehabmedik/cetakNewFormKFR.docx
+++ b/public/doc/input/rehabmedik/cetakNewFormKFR.docx
@@ -2,6 +2,38 @@
 <file path=word/document.xml><?xml version="1.0" encoding="utf-8"?>
 <w:document xmlns:wpc="http://schemas.microsoft.com/office/word/2010/wordprocessingCanvas" xmlns:cx="http://schemas.microsoft.com/office/drawing/2014/chartex" xmlns:cx1="http://schemas.microsoft.com/office/drawing/2015/9/8/chartex" xmlns:cx2="http://schemas.microsoft.com/office/drawing/2015/10/21/chartex" xmlns:cx3="http://schemas.microsoft.com/office/drawing/2016/5/9/chartex" xmlns:cx4="http://schemas.microsoft.com/office/drawing/2016/5/10/chartex" xmlns:cx5="http://schemas.microsoft.com/office/drawing/2016/5/11/chartex" xmlns:cx6="http://schemas.microsoft.com/office/drawing/2016/5/12/chartex" xmlns:cx7="http://schemas.microsoft.com/office/drawing/2016/5/13/chartex" xmlns:cx8="http://schemas.microsoft.com/office/drawing/2016/5/14/chartex" xmlns:mc="http://schemas.openxmlformats.org/markup-compatibility/2006" xmlns:aink="http://schemas.microsoft.com/office/drawing/2016/ink" xmlns:am3d="http://schemas.microsoft.com/office/drawing/2017/model3d" xmlns:o="urn:schemas-microsoft-com:office:office" xmlns:oel="http://schemas.microsoft.com/office/2019/extlst" xmlns:r="http://schemas.openxmlformats.org/officeDocument/2006/relationships" xmlns:m="http://schemas.openxmlformats.org/officeDocument/2006/math" xmlns:v="urn:schemas-microsoft-com:vml" xmlns:wp14="http://schemas.microsoft.com/office/word/2010/wordprocessingDrawing" xmlns:wp="http://schemas.openxmlformats.org/drawingml/2006/wordprocessingDrawing" xmlns:w10="urn:schemas-microsoft-com:office:word" xmlns:w="http://schemas.openxmlformats.org/wordprocessingml/2006/main" xmlns:w14="http://schemas.microsoft.com/office/word/2010/wordml" xmlns:w15="http://schemas.microsoft.com/office/word/2012/wordml" xmlns:w16cex="http://schemas.microsoft.com/office/word/2018/wordml/cex" xmlns:w16cid="http://schemas.microsoft.com/office/word/2016/wordml/cid" xmlns:w16="http://schemas.microsoft.com/office/word/2018/wordml" xmlns:w16sdtdh="http://schemas.microsoft.com/office/word/2020/wordml/sdtdatahash" xmlns:w16se="http://schemas.microsoft.com/office/word/2015/wordml/symex" xmlns:wpg="http://schemas.microsoft.com/office/word/2010/wordprocessingGroup" xmlns:wpi="http://schemas.microsoft.com/office/word/2010/wordprocessingInk" xmlns:wne="http://schemas.microsoft.com/office/word/2006/wordml" xmlns:wps="http://schemas.microsoft.com/office/word/2010/wordprocessingShape" mc:Ignorable="w14 w15 w16se w16cid w16 w16cex w16sdtdh wp14">
   <w:body>
+    <w:p>
+      <w:pPr>
+        <w:spacing w:after="0"/>
+        <w:ind w:right="425"/>
+        <w:jc w:val="center"/>
+        <w:rPr>
+          <w:rFonts w:ascii="Bookman Old Style" w:hAnsi="Bookman Old Style" w:cs="Arial"/>
+          <w:b/>
+          <w:bCs/>
+          <w:lang w:val="en-US"/>
+        </w:rPr>
+      </w:pPr>
+      <w:r>
+        <w:rPr>
+          <w:rFonts w:ascii="Bookman Old Style" w:hAnsi="Bookman Old Style" w:cs="Arial"/>
+          <w:b/>
+          <w:bCs/>
+          <w:lang w:val="en-US"/>
+        </w:rPr>
+        <w:t>LEMBAR FORMULIR RAWAT JALAN</w:t>
+      </w:r>
+      <w:r>
+        <w:rPr>
+          <w:rFonts w:ascii="Bookman Old Style" w:hAnsi="Bookman Old Style" w:cs="Arial"/>
+          <w:b/>
+          <w:bCs/>
+          <w:lang w:val="en-US"/>
+        </w:rPr>
+        <w:br/>
+        <w:t>LAYANAN KEDOKTERAN FISIK DAN REHABILITASI</w:t>
+      </w:r>
+    </w:p>
     <w:p>
       <w:pPr>
         <w:spacing w:after="0"/>
@@ -16,82 +48,53 @@
           <w:lang w:val="en-US"/>
         </w:rPr>
       </w:pPr>
-      <w:r>
-        <w:rPr>
-          <w:rFonts w:ascii="Bookman Old Style" w:hAnsi="Bookman Old Style" w:cs="Arial"/>
+    </w:p>
+    <w:p>
+      <w:pPr>
+        <w:pStyle w:val="ListParagraph"/>
+        <w:spacing w:after="0" w:line="240" w:lineRule="auto"/>
+        <w:ind w:left="142" w:right="425"/>
+        <w:rPr>
+          <w:rFonts w:ascii="Bookman Old Style" w:hAnsi="Bookman Old Style"/>
           <w:b/>
           <w:bCs/>
-          <w:sz w:val="24"/>
-          <w:szCs w:val="24"/>
-          <w:lang w:val="en-US"/>
-        </w:rPr>
-        <w:t>LEMBAR FORMULIR RAWAT JALAN</w:t>
-      </w:r>
-      <w:r>
-        <w:rPr>
-          <w:rFonts w:ascii="Bookman Old Style" w:hAnsi="Bookman Old Style" w:cs="Arial"/>
+          <w:sz w:val="20"/>
+          <w:szCs w:val="20"/>
+          <w:lang w:val="en-US"/>
+        </w:rPr>
+      </w:pPr>
+      <w:proofErr w:type="spellStart"/>
+      <w:r>
+        <w:rPr>
+          <w:rFonts w:ascii="Bookman Old Style" w:hAnsi="Bookman Old Style"/>
           <w:b/>
           <w:bCs/>
-          <w:sz w:val="24"/>
-          <w:szCs w:val="24"/>
-          <w:lang w:val="en-US"/>
-        </w:rPr>
-        <w:br/>
-        <w:t>LAYANAN KEDOKTERAN FISIK DAN REHABILITASI</w:t>
-      </w:r>
-    </w:p>
-    <w:p>
-      <w:pPr>
-        <w:spacing w:after="0"/>
-        <w:ind w:right="425"/>
-        <w:jc w:val="center"/>
-        <w:rPr>
-          <w:rFonts w:ascii="Bookman Old Style" w:hAnsi="Bookman Old Style" w:cs="Arial"/>
+          <w:sz w:val="20"/>
+          <w:szCs w:val="20"/>
+          <w:lang w:val="en-US"/>
+        </w:rPr>
+        <w:t>Identitas</w:t>
+      </w:r>
+      <w:proofErr w:type="spellEnd"/>
+      <w:r>
+        <w:rPr>
+          <w:rFonts w:ascii="Bookman Old Style" w:hAnsi="Bookman Old Style"/>
           <w:b/>
           <w:bCs/>
-          <w:sz w:val="24"/>
-          <w:szCs w:val="24"/>
-          <w:lang w:val="en-US"/>
-        </w:rPr>
-      </w:pPr>
-    </w:p>
-    <w:p>
-      <w:pPr>
-        <w:pStyle w:val="ListParagraph"/>
-        <w:ind w:left="142" w:right="425"/>
+          <w:sz w:val="20"/>
+          <w:szCs w:val="20"/>
+          <w:lang w:val="en-US"/>
+        </w:rPr>
+        <w:t xml:space="preserve"> </w:t>
+      </w:r>
+      <w:proofErr w:type="spellStart"/>
+      <w:r>
         <w:rPr>
           <w:rFonts w:ascii="Bookman Old Style" w:hAnsi="Bookman Old Style"/>
           <w:b/>
           <w:bCs/>
-          <w:lang w:val="en-US"/>
-        </w:rPr>
-      </w:pPr>
-      <w:proofErr w:type="spellStart"/>
-      <w:r>
-        <w:rPr>
-          <w:rFonts w:ascii="Bookman Old Style" w:hAnsi="Bookman Old Style"/>
-          <w:b/>
-          <w:bCs/>
-          <w:lang w:val="en-US"/>
-        </w:rPr>
-        <w:t>Identitas</w:t>
-      </w:r>
-      <w:proofErr w:type="spellEnd"/>
-      <w:r>
-        <w:rPr>
-          <w:rFonts w:ascii="Bookman Old Style" w:hAnsi="Bookman Old Style"/>
-          <w:b/>
-          <w:bCs/>
-          <w:lang w:val="en-US"/>
-        </w:rPr>
-        <w:t xml:space="preserve"> </w:t>
-      </w:r>
-      <w:proofErr w:type="spellStart"/>
-      <w:r>
-        <w:rPr>
-          <w:rFonts w:ascii="Bookman Old Style" w:hAnsi="Bookman Old Style"/>
-          <w:b/>
-          <w:bCs/>
+          <w:sz w:val="20"/>
+          <w:szCs w:val="20"/>
           <w:lang w:val="en-US"/>
         </w:rPr>
         <w:t>Pasien</w:t>
@@ -105,9 +108,12 @@
           <w:tab w:val="left" w:pos="2835"/>
           <w:tab w:val="left" w:pos="2977"/>
         </w:tabs>
+        <w:spacing w:after="0" w:line="240" w:lineRule="auto"/>
         <w:ind w:left="567" w:right="425" w:hanging="426"/>
         <w:rPr>
           <w:rFonts w:ascii="Bookman Old Style" w:hAnsi="Bookman Old Style"/>
+          <w:sz w:val="20"/>
+          <w:szCs w:val="20"/>
           <w:lang w:val="en-US"/>
         </w:rPr>
       </w:pPr>
@@ -115,6 +121,8 @@
       <w:r>
         <w:rPr>
           <w:rFonts w:ascii="Bookman Old Style" w:hAnsi="Bookman Old Style"/>
+          <w:sz w:val="20"/>
+          <w:szCs w:val="20"/>
           <w:lang w:val="en-US"/>
         </w:rPr>
         <w:t>Nomor</w:t>
@@ -123,6 +131,8 @@
       <w:r>
         <w:rPr>
           <w:rFonts w:ascii="Bookman Old Style" w:hAnsi="Bookman Old Style"/>
+          <w:sz w:val="20"/>
+          <w:szCs w:val="20"/>
           <w:lang w:val="en-US"/>
         </w:rPr>
         <w:t xml:space="preserve"> </w:t>
@@ -131,6 +141,8 @@
       <w:r>
         <w:rPr>
           <w:rFonts w:ascii="Bookman Old Style" w:hAnsi="Bookman Old Style"/>
+          <w:sz w:val="20"/>
+          <w:szCs w:val="20"/>
           <w:lang w:val="en-US"/>
         </w:rPr>
         <w:t>Rekam</w:t>
@@ -139,6 +151,8 @@
       <w:r>
         <w:rPr>
           <w:rFonts w:ascii="Bookman Old Style" w:hAnsi="Bookman Old Style"/>
+          <w:sz w:val="20"/>
+          <w:szCs w:val="20"/>
           <w:lang w:val="en-US"/>
         </w:rPr>
         <w:t xml:space="preserve"> </w:t>
@@ -147,6 +161,8 @@
       <w:r>
         <w:rPr>
           <w:rFonts w:ascii="Bookman Old Style" w:hAnsi="Bookman Old Style"/>
+          <w:sz w:val="20"/>
+          <w:szCs w:val="20"/>
           <w:lang w:val="en-US"/>
         </w:rPr>
         <w:t>Medis</w:t>
@@ -155,6 +171,8 @@
       <w:r>
         <w:rPr>
           <w:rFonts w:ascii="Bookman Old Style" w:hAnsi="Bookman Old Style"/>
+          <w:sz w:val="20"/>
+          <w:szCs w:val="20"/>
           <w:lang w:val="en-US"/>
         </w:rPr>
         <w:tab/>
@@ -168,15 +186,20 @@
           <w:tab w:val="left" w:pos="2835"/>
           <w:tab w:val="left" w:pos="2977"/>
         </w:tabs>
+        <w:spacing w:after="0" w:line="240" w:lineRule="auto"/>
         <w:ind w:left="567" w:right="425" w:hanging="426"/>
         <w:rPr>
           <w:rFonts w:ascii="Bookman Old Style" w:hAnsi="Bookman Old Style"/>
-          <w:lang w:val="en-US"/>
-        </w:rPr>
-      </w:pPr>
-      <w:r>
-        <w:rPr>
-          <w:rFonts w:ascii="Bookman Old Style" w:hAnsi="Bookman Old Style"/>
+          <w:sz w:val="20"/>
+          <w:szCs w:val="20"/>
+          <w:lang w:val="en-US"/>
+        </w:rPr>
+      </w:pPr>
+      <w:r>
+        <w:rPr>
+          <w:rFonts w:ascii="Bookman Old Style" w:hAnsi="Bookman Old Style"/>
+          <w:sz w:val="20"/>
+          <w:szCs w:val="20"/>
           <w:lang w:val="en-US"/>
         </w:rPr>
         <w:t>Nam</w:t>
@@ -184,6 +207,8 @@
       <w:r>
         <w:rPr>
           <w:rFonts w:ascii="Bookman Old Style" w:hAnsi="Bookman Old Style"/>
+          <w:sz w:val="20"/>
+          <w:szCs w:val="20"/>
           <w:lang w:val="en-US"/>
         </w:rPr>
         <w:t>a</w:t>
@@ -191,6 +216,8 @@
       <w:r>
         <w:rPr>
           <w:rFonts w:ascii="Bookman Old Style" w:hAnsi="Bookman Old Style"/>
+          <w:sz w:val="20"/>
+          <w:szCs w:val="20"/>
           <w:lang w:val="en-US"/>
         </w:rPr>
         <w:t xml:space="preserve"> </w:t>
@@ -199,6 +226,8 @@
       <w:r>
         <w:rPr>
           <w:rFonts w:ascii="Bookman Old Style" w:hAnsi="Bookman Old Style"/>
+          <w:sz w:val="20"/>
+          <w:szCs w:val="20"/>
           <w:lang w:val="en-US"/>
         </w:rPr>
         <w:t>Lengkap</w:t>
@@ -207,6 +236,8 @@
       <w:r>
         <w:rPr>
           <w:rFonts w:ascii="Bookman Old Style" w:hAnsi="Bookman Old Style"/>
+          <w:sz w:val="20"/>
+          <w:szCs w:val="20"/>
           <w:lang w:val="en-US"/>
         </w:rPr>
         <w:tab/>
@@ -215,6 +246,8 @@
       <w:r>
         <w:rPr>
           <w:rFonts w:ascii="Bookman Old Style" w:hAnsi="Bookman Old Style"/>
+          <w:sz w:val="20"/>
+          <w:szCs w:val="20"/>
           <w:lang w:val="en-US"/>
         </w:rPr>
         <w:tab/>
@@ -222,6 +255,8 @@
       <w:r>
         <w:rPr>
           <w:rFonts w:ascii="Bookman Old Style" w:hAnsi="Bookman Old Style"/>
+          <w:sz w:val="20"/>
+          <w:szCs w:val="20"/>
         </w:rPr>
         <w:t>${NAMAPASIEN}</w:t>
       </w:r>
@@ -233,9 +268,12 @@
           <w:tab w:val="left" w:pos="2835"/>
           <w:tab w:val="left" w:pos="2977"/>
         </w:tabs>
+        <w:spacing w:after="0" w:line="240" w:lineRule="auto"/>
         <w:ind w:left="567" w:right="425" w:hanging="426"/>
         <w:rPr>
           <w:rFonts w:ascii="Bookman Old Style" w:hAnsi="Bookman Old Style"/>
+          <w:sz w:val="20"/>
+          <w:szCs w:val="20"/>
           <w:lang w:val="en-US"/>
         </w:rPr>
       </w:pPr>
@@ -243,6 +281,8 @@
       <w:r>
         <w:rPr>
           <w:rFonts w:ascii="Bookman Old Style" w:hAnsi="Bookman Old Style"/>
+          <w:sz w:val="20"/>
+          <w:szCs w:val="20"/>
           <w:lang w:val="en-US"/>
         </w:rPr>
         <w:t>Tanggal</w:t>
@@ -251,6 +291,8 @@
       <w:r>
         <w:rPr>
           <w:rFonts w:ascii="Bookman Old Style" w:hAnsi="Bookman Old Style"/>
+          <w:sz w:val="20"/>
+          <w:szCs w:val="20"/>
           <w:lang w:val="en-US"/>
         </w:rPr>
         <w:t xml:space="preserve"> Lahir</w:t>
@@ -258,6 +300,8 @@
       <w:r>
         <w:rPr>
           <w:rFonts w:ascii="Bookman Old Style" w:hAnsi="Bookman Old Style"/>
+          <w:sz w:val="20"/>
+          <w:szCs w:val="20"/>
           <w:lang w:val="en-US"/>
         </w:rPr>
         <w:t xml:space="preserve"> / </w:t>
@@ -266,6 +310,8 @@
       <w:r>
         <w:rPr>
           <w:rFonts w:ascii="Bookman Old Style" w:hAnsi="Bookman Old Style"/>
+          <w:sz w:val="20"/>
+          <w:szCs w:val="20"/>
           <w:lang w:val="en-US"/>
         </w:rPr>
         <w:t>Umur</w:t>
@@ -274,6 +320,8 @@
       <w:r>
         <w:rPr>
           <w:rFonts w:ascii="Bookman Old Style" w:hAnsi="Bookman Old Style"/>
+          <w:sz w:val="20"/>
+          <w:szCs w:val="20"/>
           <w:lang w:val="en-US"/>
         </w:rPr>
         <w:tab/>
@@ -282,6 +330,8 @@
       <w:r>
         <w:rPr>
           <w:rFonts w:ascii="Bookman Old Style" w:hAnsi="Bookman Old Style"/>
+          <w:sz w:val="20"/>
+          <w:szCs w:val="20"/>
           <w:lang w:val="en-US"/>
         </w:rPr>
         <w:tab/>
@@ -289,12 +339,16 @@
       <w:r>
         <w:rPr>
           <w:rFonts w:ascii="Bookman Old Style" w:hAnsi="Bookman Old Style"/>
+          <w:sz w:val="20"/>
+          <w:szCs w:val="20"/>
         </w:rPr>
         <w:t>${TGLLAHIRPASIEN}</w:t>
       </w:r>
       <w:r>
         <w:rPr>
           <w:rFonts w:ascii="Bookman Old Style" w:hAnsi="Bookman Old Style"/>
+          <w:sz w:val="20"/>
+          <w:szCs w:val="20"/>
           <w:lang w:val="en-US"/>
         </w:rPr>
         <w:t xml:space="preserve"> (</w:t>
@@ -302,12 +356,16 @@
       <w:r>
         <w:rPr>
           <w:rFonts w:ascii="Bookman Old Style" w:hAnsi="Bookman Old Style"/>
+          <w:sz w:val="20"/>
+          <w:szCs w:val="20"/>
         </w:rPr>
         <w:t>${UMURPASIEN}</w:t>
       </w:r>
       <w:r>
         <w:rPr>
           <w:rFonts w:ascii="Bookman Old Style" w:hAnsi="Bookman Old Style"/>
+          <w:sz w:val="20"/>
+          <w:szCs w:val="20"/>
           <w:lang w:val="en-US"/>
         </w:rPr>
         <w:t>)</w:t>
@@ -320,15 +378,20 @@
           <w:tab w:val="left" w:pos="2835"/>
           <w:tab w:val="left" w:pos="2977"/>
         </w:tabs>
+        <w:spacing w:after="0" w:line="240" w:lineRule="auto"/>
         <w:ind w:left="2977" w:right="425" w:hanging="2836"/>
         <w:rPr>
           <w:rFonts w:ascii="Bookman Old Style" w:hAnsi="Bookman Old Style"/>
-          <w:lang w:val="en-US"/>
-        </w:rPr>
-      </w:pPr>
-      <w:r>
-        <w:rPr>
-          <w:rFonts w:ascii="Bookman Old Style" w:hAnsi="Bookman Old Style"/>
+          <w:sz w:val="20"/>
+          <w:szCs w:val="20"/>
+          <w:lang w:val="en-US"/>
+        </w:rPr>
+      </w:pPr>
+      <w:r>
+        <w:rPr>
+          <w:rFonts w:ascii="Bookman Old Style" w:hAnsi="Bookman Old Style"/>
+          <w:sz w:val="20"/>
+          <w:szCs w:val="20"/>
           <w:lang w:val="en-US"/>
         </w:rPr>
         <w:t>Alamat</w:t>
@@ -336,6 +399,8 @@
       <w:r>
         <w:rPr>
           <w:rFonts w:ascii="Bookman Old Style" w:hAnsi="Bookman Old Style"/>
+          <w:sz w:val="20"/>
+          <w:szCs w:val="20"/>
           <w:lang w:val="en-US"/>
         </w:rPr>
         <w:tab/>
@@ -344,6 +409,8 @@
       <w:r>
         <w:rPr>
           <w:rFonts w:ascii="Bookman Old Style" w:hAnsi="Bookman Old Style"/>
+          <w:sz w:val="20"/>
+          <w:szCs w:val="20"/>
           <w:lang w:val="en-US"/>
         </w:rPr>
         <w:tab/>
@@ -351,18 +418,24 @@
       <w:r>
         <w:rPr>
           <w:rFonts w:ascii="Bookman Old Style" w:hAnsi="Bookman Old Style"/>
+          <w:sz w:val="20"/>
+          <w:szCs w:val="20"/>
         </w:rPr>
         <w:t>${</w:t>
       </w:r>
       <w:r>
         <w:rPr>
           <w:rFonts w:ascii="Bookman Old Style" w:hAnsi="Bookman Old Style"/>
+          <w:sz w:val="20"/>
+          <w:szCs w:val="20"/>
         </w:rPr>
         <w:t>ALAMATPASIEN</w:t>
       </w:r>
       <w:r>
         <w:rPr>
           <w:rFonts w:ascii="Bookman Old Style" w:hAnsi="Bookman Old Style"/>
+          <w:sz w:val="20"/>
+          <w:szCs w:val="20"/>
         </w:rPr>
         <w:t>}</w:t>
       </w:r>
@@ -370,9 +443,12 @@
     <w:p>
       <w:pPr>
         <w:pStyle w:val="ListParagraph"/>
+        <w:spacing w:after="0" w:line="240" w:lineRule="auto"/>
         <w:ind w:left="142" w:right="425"/>
         <w:rPr>
           <w:rFonts w:ascii="Bookman Old Style" w:hAnsi="Bookman Old Style"/>
+          <w:sz w:val="20"/>
+          <w:szCs w:val="20"/>
           <w:lang w:val="en-US"/>
         </w:rPr>
       </w:pPr>
@@ -380,11 +456,14 @@
     <w:p>
       <w:pPr>
         <w:pStyle w:val="ListParagraph"/>
+        <w:spacing w:after="0" w:line="240" w:lineRule="auto"/>
         <w:ind w:left="142" w:right="425"/>
         <w:rPr>
           <w:rFonts w:ascii="Bookman Old Style" w:hAnsi="Bookman Old Style"/>
           <w:b/>
           <w:bCs/>
+          <w:sz w:val="20"/>
+          <w:szCs w:val="20"/>
           <w:lang w:val="en-US"/>
         </w:rPr>
       </w:pPr>
@@ -393,6 +472,8 @@
           <w:rFonts w:ascii="Bookman Old Style" w:hAnsi="Bookman Old Style"/>
           <w:b/>
           <w:bCs/>
+          <w:sz w:val="20"/>
+          <w:szCs w:val="20"/>
           <w:lang w:val="en-US"/>
         </w:rPr>
         <w:t>Subjective</w:t>
@@ -401,15 +482,20 @@
     <w:p>
       <w:pPr>
         <w:pStyle w:val="ListParagraph"/>
+        <w:spacing w:after="0" w:line="240" w:lineRule="auto"/>
         <w:ind w:left="142" w:right="425"/>
         <w:rPr>
           <w:rFonts w:ascii="Bookman Old Style" w:hAnsi="Bookman Old Style"/>
-          <w:lang w:val="en-US"/>
-        </w:rPr>
-      </w:pPr>
-      <w:r>
-        <w:rPr>
-          <w:rFonts w:ascii="Bookman Old Style" w:hAnsi="Bookman Old Style"/>
+          <w:sz w:val="18"/>
+          <w:szCs w:val="18"/>
+          <w:lang w:val="en-US"/>
+        </w:rPr>
+      </w:pPr>
+      <w:r>
+        <w:rPr>
+          <w:rFonts w:ascii="Bookman Old Style" w:hAnsi="Bookman Old Style"/>
+          <w:sz w:val="18"/>
+          <w:szCs w:val="18"/>
           <w:lang w:val="en-US"/>
         </w:rPr>
         <w:t>${</w:t>
@@ -417,6 +503,8 @@
       <w:r>
         <w:rPr>
           <w:rFonts w:ascii="Bookman Old Style" w:hAnsi="Bookman Old Style"/>
+          <w:sz w:val="18"/>
+          <w:szCs w:val="18"/>
           <w:lang w:val="en-US"/>
         </w:rPr>
         <w:t>SUBYEKTIF</w:t>
@@ -424,6 +512,8 @@
       <w:r>
         <w:rPr>
           <w:rFonts w:ascii="Bookman Old Style" w:hAnsi="Bookman Old Style"/>
+          <w:sz w:val="18"/>
+          <w:szCs w:val="18"/>
           <w:lang w:val="en-US"/>
         </w:rPr>
         <w:t>}</w:t>
@@ -432,11 +522,27 @@
     <w:p>
       <w:pPr>
         <w:pStyle w:val="ListParagraph"/>
+        <w:spacing w:after="0" w:line="240" w:lineRule="auto"/>
+        <w:ind w:left="142" w:right="425"/>
+        <w:rPr>
+          <w:rFonts w:ascii="Bookman Old Style" w:hAnsi="Bookman Old Style"/>
+          <w:sz w:val="10"/>
+          <w:szCs w:val="10"/>
+          <w:lang w:val="en-US"/>
+        </w:rPr>
+      </w:pPr>
+    </w:p>
+    <w:p>
+      <w:pPr>
+        <w:pStyle w:val="ListParagraph"/>
+        <w:spacing w:after="0" w:line="240" w:lineRule="auto"/>
         <w:ind w:left="142" w:right="425"/>
         <w:rPr>
           <w:rFonts w:ascii="Bookman Old Style" w:hAnsi="Bookman Old Style"/>
           <w:b/>
           <w:bCs/>
+          <w:sz w:val="20"/>
+          <w:szCs w:val="20"/>
           <w:lang w:val="en-US"/>
         </w:rPr>
       </w:pPr>
@@ -445,6 +551,8 @@
           <w:rFonts w:ascii="Bookman Old Style" w:hAnsi="Bookman Old Style"/>
           <w:b/>
           <w:bCs/>
+          <w:sz w:val="20"/>
+          <w:szCs w:val="20"/>
           <w:lang w:val="en-US"/>
         </w:rPr>
         <w:t>Objective</w:t>
@@ -453,15 +561,20 @@
     <w:p>
       <w:pPr>
         <w:pStyle w:val="ListParagraph"/>
+        <w:spacing w:after="0" w:line="240" w:lineRule="auto"/>
         <w:ind w:left="142" w:right="425"/>
         <w:rPr>
           <w:rFonts w:ascii="Bookman Old Style" w:hAnsi="Bookman Old Style"/>
-          <w:lang w:val="en-US"/>
-        </w:rPr>
-      </w:pPr>
-      <w:r>
-        <w:rPr>
-          <w:rFonts w:ascii="Bookman Old Style" w:hAnsi="Bookman Old Style"/>
+          <w:sz w:val="18"/>
+          <w:szCs w:val="18"/>
+          <w:lang w:val="en-US"/>
+        </w:rPr>
+      </w:pPr>
+      <w:r>
+        <w:rPr>
+          <w:rFonts w:ascii="Bookman Old Style" w:hAnsi="Bookman Old Style"/>
+          <w:sz w:val="18"/>
+          <w:szCs w:val="18"/>
           <w:lang w:val="en-US"/>
         </w:rPr>
         <w:t>${</w:t>
@@ -469,6 +582,8 @@
       <w:r>
         <w:rPr>
           <w:rFonts w:ascii="Bookman Old Style" w:hAnsi="Bookman Old Style"/>
+          <w:sz w:val="18"/>
+          <w:szCs w:val="18"/>
           <w:lang w:val="en-US"/>
         </w:rPr>
         <w:t>OBYEKTIF</w:t>
@@ -476,6 +591,8 @@
       <w:r>
         <w:rPr>
           <w:rFonts w:ascii="Bookman Old Style" w:hAnsi="Bookman Old Style"/>
+          <w:sz w:val="18"/>
+          <w:szCs w:val="18"/>
           <w:lang w:val="en-US"/>
         </w:rPr>
         <w:t>}</w:t>
@@ -484,11 +601,27 @@
     <w:p>
       <w:pPr>
         <w:pStyle w:val="ListParagraph"/>
+        <w:spacing w:after="0" w:line="240" w:lineRule="auto"/>
+        <w:ind w:left="142" w:right="425"/>
+        <w:rPr>
+          <w:rFonts w:ascii="Bookman Old Style" w:hAnsi="Bookman Old Style"/>
+          <w:sz w:val="10"/>
+          <w:szCs w:val="10"/>
+          <w:lang w:val="en-US"/>
+        </w:rPr>
+      </w:pPr>
+    </w:p>
+    <w:p>
+      <w:pPr>
+        <w:pStyle w:val="ListParagraph"/>
+        <w:spacing w:after="0" w:line="240" w:lineRule="auto"/>
         <w:ind w:left="142" w:right="425"/>
         <w:rPr>
           <w:rFonts w:ascii="Bookman Old Style" w:hAnsi="Bookman Old Style"/>
           <w:b/>
           <w:bCs/>
+          <w:sz w:val="20"/>
+          <w:szCs w:val="20"/>
           <w:lang w:val="en-US"/>
         </w:rPr>
       </w:pPr>
@@ -497,6 +630,8 @@
           <w:rFonts w:ascii="Bookman Old Style" w:hAnsi="Bookman Old Style"/>
           <w:b/>
           <w:bCs/>
+          <w:sz w:val="20"/>
+          <w:szCs w:val="20"/>
           <w:lang w:val="en-US"/>
         </w:rPr>
         <w:t>Assessment</w:t>
@@ -505,15 +640,20 @@
     <w:p>
       <w:pPr>
         <w:pStyle w:val="ListParagraph"/>
+        <w:spacing w:after="0" w:line="240" w:lineRule="auto"/>
         <w:ind w:left="142" w:right="425"/>
         <w:rPr>
           <w:rFonts w:ascii="Bookman Old Style" w:hAnsi="Bookman Old Style"/>
-          <w:lang w:val="en-US"/>
-        </w:rPr>
-      </w:pPr>
-      <w:r>
-        <w:rPr>
-          <w:rFonts w:ascii="Bookman Old Style" w:hAnsi="Bookman Old Style"/>
+          <w:sz w:val="18"/>
+          <w:szCs w:val="18"/>
+          <w:lang w:val="en-US"/>
+        </w:rPr>
+      </w:pPr>
+      <w:r>
+        <w:rPr>
+          <w:rFonts w:ascii="Bookman Old Style" w:hAnsi="Bookman Old Style"/>
+          <w:sz w:val="18"/>
+          <w:szCs w:val="18"/>
           <w:lang w:val="en-US"/>
         </w:rPr>
         <w:t>${</w:t>
@@ -521,6 +661,8 @@
       <w:r>
         <w:rPr>
           <w:rFonts w:ascii="Bookman Old Style" w:hAnsi="Bookman Old Style"/>
+          <w:sz w:val="18"/>
+          <w:szCs w:val="18"/>
           <w:lang w:val="en-US"/>
         </w:rPr>
         <w:t>ASSESMENT</w:t>
@@ -528,6 +670,8 @@
       <w:r>
         <w:rPr>
           <w:rFonts w:ascii="Bookman Old Style" w:hAnsi="Bookman Old Style"/>
+          <w:sz w:val="18"/>
+          <w:szCs w:val="18"/>
           <w:lang w:val="en-US"/>
         </w:rPr>
         <w:t>}</w:t>
@@ -536,11 +680,27 @@
     <w:p>
       <w:pPr>
         <w:pStyle w:val="ListParagraph"/>
+        <w:spacing w:after="0" w:line="240" w:lineRule="auto"/>
+        <w:ind w:left="142" w:right="425"/>
+        <w:rPr>
+          <w:rFonts w:ascii="Bookman Old Style" w:hAnsi="Bookman Old Style"/>
+          <w:sz w:val="10"/>
+          <w:szCs w:val="10"/>
+          <w:lang w:val="en-US"/>
+        </w:rPr>
+      </w:pPr>
+    </w:p>
+    <w:p>
+      <w:pPr>
+        <w:pStyle w:val="ListParagraph"/>
+        <w:spacing w:after="0" w:line="240" w:lineRule="auto"/>
         <w:ind w:left="142" w:right="425"/>
         <w:rPr>
           <w:rFonts w:ascii="Bookman Old Style" w:hAnsi="Bookman Old Style"/>
           <w:b/>
           <w:bCs/>
+          <w:sz w:val="20"/>
+          <w:szCs w:val="20"/>
           <w:lang w:val="en-US"/>
         </w:rPr>
       </w:pPr>
@@ -549,6 +709,8 @@
           <w:rFonts w:ascii="Bookman Old Style" w:hAnsi="Bookman Old Style"/>
           <w:b/>
           <w:bCs/>
+          <w:sz w:val="20"/>
+          <w:szCs w:val="20"/>
           <w:lang w:val="en-US"/>
         </w:rPr>
         <w:t>Planning</w:t>
@@ -561,15 +723,20 @@
           <w:ilvl w:val="0"/>
           <w:numId w:val="4"/>
         </w:numPr>
+        <w:spacing w:after="0" w:line="240" w:lineRule="auto"/>
         <w:ind w:left="709" w:right="425"/>
         <w:rPr>
           <w:rFonts w:ascii="Bookman Old Style" w:hAnsi="Bookman Old Style"/>
-          <w:lang w:val="en-US"/>
-        </w:rPr>
-      </w:pPr>
-      <w:r>
-        <w:rPr>
-          <w:rFonts w:ascii="Bookman Old Style" w:hAnsi="Bookman Old Style"/>
+          <w:sz w:val="20"/>
+          <w:szCs w:val="20"/>
+          <w:lang w:val="en-US"/>
+        </w:rPr>
+      </w:pPr>
+      <w:r>
+        <w:rPr>
+          <w:rFonts w:ascii="Bookman Old Style" w:hAnsi="Bookman Old Style"/>
+          <w:sz w:val="20"/>
+          <w:szCs w:val="20"/>
           <w:lang w:val="en-US"/>
         </w:rPr>
         <w:t>Goal of Treatment:</w:t>
@@ -578,15 +745,20 @@
     <w:p>
       <w:pPr>
         <w:pStyle w:val="ListParagraph"/>
+        <w:spacing w:after="0" w:line="240" w:lineRule="auto"/>
         <w:ind w:left="709" w:right="425"/>
         <w:rPr>
           <w:rFonts w:ascii="Bookman Old Style" w:hAnsi="Bookman Old Style"/>
-          <w:lang w:val="en-US"/>
-        </w:rPr>
-      </w:pPr>
-      <w:r>
-        <w:rPr>
-          <w:rFonts w:ascii="Bookman Old Style" w:hAnsi="Bookman Old Style"/>
+          <w:sz w:val="18"/>
+          <w:szCs w:val="18"/>
+          <w:lang w:val="en-US"/>
+        </w:rPr>
+      </w:pPr>
+      <w:r>
+        <w:rPr>
+          <w:rFonts w:ascii="Bookman Old Style" w:hAnsi="Bookman Old Style"/>
+          <w:sz w:val="18"/>
+          <w:szCs w:val="18"/>
           <w:lang w:val="en-US"/>
         </w:rPr>
         <w:t>${PLANNING1}</w:t>
@@ -599,15 +771,20 @@
           <w:ilvl w:val="0"/>
           <w:numId w:val="4"/>
         </w:numPr>
+        <w:spacing w:after="0" w:line="240" w:lineRule="auto"/>
         <w:ind w:left="709" w:right="425"/>
         <w:rPr>
           <w:rFonts w:ascii="Bookman Old Style" w:hAnsi="Bookman Old Style"/>
-          <w:lang w:val="en-US"/>
-        </w:rPr>
-      </w:pPr>
-      <w:r>
-        <w:rPr>
-          <w:rFonts w:ascii="Bookman Old Style" w:hAnsi="Bookman Old Style"/>
+          <w:sz w:val="20"/>
+          <w:szCs w:val="20"/>
+          <w:lang w:val="en-US"/>
+        </w:rPr>
+      </w:pPr>
+      <w:r>
+        <w:rPr>
+          <w:rFonts w:ascii="Bookman Old Style" w:hAnsi="Bookman Old Style"/>
+          <w:sz w:val="20"/>
+          <w:szCs w:val="20"/>
           <w:lang w:val="en-US"/>
         </w:rPr>
         <w:t xml:space="preserve">Tindakan/Program </w:t>
@@ -616,6 +793,8 @@
       <w:r>
         <w:rPr>
           <w:rFonts w:ascii="Bookman Old Style" w:hAnsi="Bookman Old Style"/>
+          <w:sz w:val="20"/>
+          <w:szCs w:val="20"/>
           <w:lang w:val="en-US"/>
         </w:rPr>
         <w:t>Rehabilitasi</w:t>
@@ -624,6 +803,8 @@
       <w:r>
         <w:rPr>
           <w:rFonts w:ascii="Bookman Old Style" w:hAnsi="Bookman Old Style"/>
+          <w:sz w:val="20"/>
+          <w:szCs w:val="20"/>
           <w:lang w:val="en-US"/>
         </w:rPr>
         <w:t xml:space="preserve"> </w:t>
@@ -632,6 +813,8 @@
       <w:r>
         <w:rPr>
           <w:rFonts w:ascii="Bookman Old Style" w:hAnsi="Bookman Old Style"/>
+          <w:sz w:val="20"/>
+          <w:szCs w:val="20"/>
           <w:lang w:val="en-US"/>
         </w:rPr>
         <w:t>Medik</w:t>
@@ -640,6 +823,8 @@
       <w:r>
         <w:rPr>
           <w:rFonts w:ascii="Bookman Old Style" w:hAnsi="Bookman Old Style"/>
+          <w:sz w:val="20"/>
+          <w:szCs w:val="20"/>
           <w:lang w:val="en-US"/>
         </w:rPr>
         <w:t>:</w:t>
@@ -648,15 +833,20 @@
     <w:p>
       <w:pPr>
         <w:pStyle w:val="ListParagraph"/>
+        <w:spacing w:after="0" w:line="240" w:lineRule="auto"/>
         <w:ind w:left="709" w:right="425"/>
         <w:rPr>
           <w:rFonts w:ascii="Bookman Old Style" w:hAnsi="Bookman Old Style"/>
-          <w:lang w:val="en-US"/>
-        </w:rPr>
-      </w:pPr>
-      <w:r>
-        <w:rPr>
-          <w:rFonts w:ascii="Bookman Old Style" w:hAnsi="Bookman Old Style"/>
+          <w:sz w:val="18"/>
+          <w:szCs w:val="18"/>
+          <w:lang w:val="en-US"/>
+        </w:rPr>
+      </w:pPr>
+      <w:r>
+        <w:rPr>
+          <w:rFonts w:ascii="Bookman Old Style" w:hAnsi="Bookman Old Style"/>
+          <w:sz w:val="18"/>
+          <w:szCs w:val="18"/>
           <w:lang w:val="en-US"/>
         </w:rPr>
         <w:t>${PLANNING2}</w:t>
@@ -669,9 +859,12 @@
           <w:ilvl w:val="0"/>
           <w:numId w:val="4"/>
         </w:numPr>
+        <w:spacing w:after="0" w:line="240" w:lineRule="auto"/>
         <w:ind w:left="709" w:right="425"/>
         <w:rPr>
           <w:rFonts w:ascii="Bookman Old Style" w:hAnsi="Bookman Old Style"/>
+          <w:sz w:val="20"/>
+          <w:szCs w:val="20"/>
           <w:lang w:val="en-US"/>
         </w:rPr>
       </w:pPr>
@@ -679,6 +872,8 @@
       <w:r>
         <w:rPr>
           <w:rFonts w:ascii="Bookman Old Style" w:hAnsi="Bookman Old Style"/>
+          <w:sz w:val="20"/>
+          <w:szCs w:val="20"/>
           <w:lang w:val="en-US"/>
         </w:rPr>
         <w:t>Edukasi</w:t>
@@ -687,6 +882,8 @@
       <w:r>
         <w:rPr>
           <w:rFonts w:ascii="Bookman Old Style" w:hAnsi="Bookman Old Style"/>
+          <w:sz w:val="20"/>
+          <w:szCs w:val="20"/>
           <w:lang w:val="en-US"/>
         </w:rPr>
         <w:t>:</w:t>
@@ -695,15 +892,20 @@
     <w:p>
       <w:pPr>
         <w:pStyle w:val="ListParagraph"/>
+        <w:spacing w:after="0" w:line="240" w:lineRule="auto"/>
         <w:ind w:left="709" w:right="425"/>
         <w:rPr>
           <w:rFonts w:ascii="Bookman Old Style" w:hAnsi="Bookman Old Style"/>
-          <w:lang w:val="en-US"/>
-        </w:rPr>
-      </w:pPr>
-      <w:r>
-        <w:rPr>
-          <w:rFonts w:ascii="Bookman Old Style" w:hAnsi="Bookman Old Style"/>
+          <w:sz w:val="18"/>
+          <w:szCs w:val="18"/>
+          <w:lang w:val="en-US"/>
+        </w:rPr>
+      </w:pPr>
+      <w:r>
+        <w:rPr>
+          <w:rFonts w:ascii="Bookman Old Style" w:hAnsi="Bookman Old Style"/>
+          <w:sz w:val="18"/>
+          <w:szCs w:val="18"/>
           <w:lang w:val="en-US"/>
         </w:rPr>
         <w:t>${PLANNING3}</w:t>
@@ -716,9 +918,12 @@
           <w:ilvl w:val="0"/>
           <w:numId w:val="4"/>
         </w:numPr>
+        <w:spacing w:after="0" w:line="240" w:lineRule="auto"/>
         <w:ind w:left="709" w:right="425"/>
         <w:rPr>
           <w:rFonts w:ascii="Bookman Old Style" w:hAnsi="Bookman Old Style"/>
+          <w:sz w:val="20"/>
+          <w:szCs w:val="20"/>
           <w:lang w:val="en-US"/>
         </w:rPr>
       </w:pPr>
@@ -726,6 +931,8 @@
       <w:r>
         <w:rPr>
           <w:rFonts w:ascii="Bookman Old Style" w:hAnsi="Bookman Old Style"/>
+          <w:sz w:val="20"/>
+          <w:szCs w:val="20"/>
           <w:lang w:val="en-US"/>
         </w:rPr>
         <w:t>Frekuensi</w:t>
@@ -734,6 +941,8 @@
       <w:r>
         <w:rPr>
           <w:rFonts w:ascii="Bookman Old Style" w:hAnsi="Bookman Old Style"/>
+          <w:sz w:val="20"/>
+          <w:szCs w:val="20"/>
           <w:lang w:val="en-US"/>
         </w:rPr>
         <w:t xml:space="preserve"> </w:t>
@@ -742,6 +951,8 @@
       <w:r>
         <w:rPr>
           <w:rFonts w:ascii="Bookman Old Style" w:hAnsi="Bookman Old Style"/>
+          <w:sz w:val="20"/>
+          <w:szCs w:val="20"/>
           <w:lang w:val="en-US"/>
         </w:rPr>
         <w:t>Kunjungan</w:t>
@@ -750,6 +961,8 @@
       <w:r>
         <w:rPr>
           <w:rFonts w:ascii="Bookman Old Style" w:hAnsi="Bookman Old Style"/>
+          <w:sz w:val="20"/>
+          <w:szCs w:val="20"/>
           <w:lang w:val="en-US"/>
         </w:rPr>
         <w:t>:</w:t>
@@ -758,18 +971,237 @@
     <w:p>
       <w:pPr>
         <w:pStyle w:val="ListParagraph"/>
+        <w:spacing w:after="0" w:line="240" w:lineRule="auto"/>
         <w:ind w:left="709" w:right="425"/>
         <w:rPr>
           <w:rFonts w:ascii="Bookman Old Style" w:hAnsi="Bookman Old Style"/>
-          <w:lang w:val="en-US"/>
-        </w:rPr>
-      </w:pPr>
-      <w:r>
-        <w:rPr>
-          <w:rFonts w:ascii="Bookman Old Style" w:hAnsi="Bookman Old Style"/>
+          <w:sz w:val="18"/>
+          <w:szCs w:val="18"/>
+          <w:lang w:val="en-US"/>
+        </w:rPr>
+      </w:pPr>
+      <w:r>
+        <w:rPr>
+          <w:rFonts w:ascii="Bookman Old Style" w:hAnsi="Bookman Old Style"/>
+          <w:sz w:val="18"/>
+          <w:szCs w:val="18"/>
           <w:lang w:val="en-US"/>
         </w:rPr>
         <w:t>${PLANNING4}</w:t>
+      </w:r>
+    </w:p>
+    <w:p>
+      <w:pPr>
+        <w:pStyle w:val="ListParagraph"/>
+        <w:spacing w:after="0" w:line="240" w:lineRule="auto"/>
+        <w:ind w:left="142" w:right="425"/>
+        <w:rPr>
+          <w:rFonts w:ascii="Bookman Old Style" w:hAnsi="Bookman Old Style"/>
+          <w:b/>
+          <w:bCs/>
+          <w:sz w:val="10"/>
+          <w:szCs w:val="10"/>
+          <w:lang w:val="en-US"/>
+        </w:rPr>
+      </w:pPr>
+    </w:p>
+    <w:p>
+      <w:pPr>
+        <w:pStyle w:val="ListParagraph"/>
+        <w:spacing w:after="0" w:line="240" w:lineRule="auto"/>
+        <w:ind w:left="142" w:right="425"/>
+        <w:rPr>
+          <w:rFonts w:ascii="Bookman Old Style" w:hAnsi="Bookman Old Style"/>
+          <w:b/>
+          <w:bCs/>
+          <w:sz w:val="20"/>
+          <w:szCs w:val="20"/>
+          <w:lang w:val="en-US"/>
+        </w:rPr>
+      </w:pPr>
+      <w:proofErr w:type="spellStart"/>
+      <w:r>
+        <w:rPr>
+          <w:rFonts w:ascii="Bookman Old Style" w:hAnsi="Bookman Old Style"/>
+          <w:b/>
+          <w:bCs/>
+          <w:sz w:val="20"/>
+          <w:szCs w:val="20"/>
+          <w:lang w:val="en-US"/>
+        </w:rPr>
+        <w:t>Rencana</w:t>
+      </w:r>
+      <w:proofErr w:type="spellEnd"/>
+      <w:r>
+        <w:rPr>
+          <w:rFonts w:ascii="Bookman Old Style" w:hAnsi="Bookman Old Style"/>
+          <w:b/>
+          <w:bCs/>
+          <w:sz w:val="20"/>
+          <w:szCs w:val="20"/>
+          <w:lang w:val="en-US"/>
+        </w:rPr>
+        <w:t xml:space="preserve"> </w:t>
+      </w:r>
+      <w:proofErr w:type="spellStart"/>
+      <w:r>
+        <w:rPr>
+          <w:rFonts w:ascii="Bookman Old Style" w:hAnsi="Bookman Old Style"/>
+          <w:b/>
+          <w:bCs/>
+          <w:sz w:val="20"/>
+          <w:szCs w:val="20"/>
+          <w:lang w:val="en-US"/>
+        </w:rPr>
+        <w:t>Tindak</w:t>
+      </w:r>
+      <w:proofErr w:type="spellEnd"/>
+      <w:r>
+        <w:rPr>
+          <w:rFonts w:ascii="Bookman Old Style" w:hAnsi="Bookman Old Style"/>
+          <w:b/>
+          <w:bCs/>
+          <w:sz w:val="20"/>
+          <w:szCs w:val="20"/>
+          <w:lang w:val="en-US"/>
+        </w:rPr>
+        <w:t xml:space="preserve"> </w:t>
+      </w:r>
+      <w:proofErr w:type="spellStart"/>
+      <w:r>
+        <w:rPr>
+          <w:rFonts w:ascii="Bookman Old Style" w:hAnsi="Bookman Old Style"/>
+          <w:b/>
+          <w:bCs/>
+          <w:sz w:val="20"/>
+          <w:szCs w:val="20"/>
+          <w:lang w:val="en-US"/>
+        </w:rPr>
+        <w:t>Lanjut</w:t>
+      </w:r>
+      <w:proofErr w:type="spellEnd"/>
+      <w:r>
+        <w:rPr>
+          <w:rFonts w:ascii="Bookman Old Style" w:hAnsi="Bookman Old Style"/>
+          <w:b/>
+          <w:bCs/>
+          <w:sz w:val="20"/>
+          <w:szCs w:val="20"/>
+          <w:lang w:val="en-US"/>
+        </w:rPr>
+        <w:t xml:space="preserve"> (</w:t>
+      </w:r>
+      <w:proofErr w:type="spellStart"/>
+      <w:r>
+        <w:rPr>
+          <w:rFonts w:ascii="Bookman Old Style" w:hAnsi="Bookman Old Style"/>
+          <w:b/>
+          <w:bCs/>
+          <w:sz w:val="20"/>
+          <w:szCs w:val="20"/>
+          <w:lang w:val="en-US"/>
+        </w:rPr>
+        <w:t>Evaluasi</w:t>
+      </w:r>
+      <w:proofErr w:type="spellEnd"/>
+      <w:r>
+        <w:rPr>
+          <w:rFonts w:ascii="Bookman Old Style" w:hAnsi="Bookman Old Style"/>
+          <w:b/>
+          <w:bCs/>
+          <w:sz w:val="20"/>
+          <w:szCs w:val="20"/>
+          <w:lang w:val="en-US"/>
+        </w:rPr>
+        <w:t xml:space="preserve"> / </w:t>
+      </w:r>
+      <w:proofErr w:type="spellStart"/>
+      <w:r>
+        <w:rPr>
+          <w:rFonts w:ascii="Bookman Old Style" w:hAnsi="Bookman Old Style"/>
+          <w:b/>
+          <w:bCs/>
+          <w:sz w:val="20"/>
+          <w:szCs w:val="20"/>
+          <w:lang w:val="en-US"/>
+        </w:rPr>
+        <w:t>Rujuk</w:t>
+      </w:r>
+      <w:proofErr w:type="spellEnd"/>
+      <w:r>
+        <w:rPr>
+          <w:rFonts w:ascii="Bookman Old Style" w:hAnsi="Bookman Old Style"/>
+          <w:b/>
+          <w:bCs/>
+          <w:sz w:val="20"/>
+          <w:szCs w:val="20"/>
+          <w:lang w:val="en-US"/>
+        </w:rPr>
+        <w:t xml:space="preserve"> / </w:t>
+      </w:r>
+      <w:proofErr w:type="spellStart"/>
+      <w:r>
+        <w:rPr>
+          <w:rFonts w:ascii="Bookman Old Style" w:hAnsi="Bookman Old Style"/>
+          <w:b/>
+          <w:bCs/>
+          <w:sz w:val="20"/>
+          <w:szCs w:val="20"/>
+          <w:lang w:val="en-US"/>
+        </w:rPr>
+        <w:t>Selesai</w:t>
+      </w:r>
+      <w:proofErr w:type="spellEnd"/>
+      <w:r>
+        <w:rPr>
+          <w:rFonts w:ascii="Bookman Old Style" w:hAnsi="Bookman Old Style"/>
+          <w:b/>
+          <w:bCs/>
+          <w:sz w:val="20"/>
+          <w:szCs w:val="20"/>
+          <w:lang w:val="en-US"/>
+        </w:rPr>
+        <w:t>)</w:t>
+      </w:r>
+    </w:p>
+    <w:p>
+      <w:pPr>
+        <w:pStyle w:val="ListParagraph"/>
+        <w:spacing w:after="0" w:line="240" w:lineRule="auto"/>
+        <w:ind w:left="142" w:right="425"/>
+        <w:rPr>
+          <w:rFonts w:ascii="Bookman Old Style" w:hAnsi="Bookman Old Style"/>
+          <w:sz w:val="18"/>
+          <w:szCs w:val="18"/>
+          <w:lang w:val="en-US"/>
+        </w:rPr>
+      </w:pPr>
+      <w:r>
+        <w:rPr>
+          <w:rFonts w:ascii="Bookman Old Style" w:hAnsi="Bookman Old Style"/>
+          <w:sz w:val="18"/>
+          <w:szCs w:val="18"/>
+          <w:lang w:val="en-US"/>
+        </w:rPr>
+        <w:t>${</w:t>
+      </w:r>
+      <w:r>
+        <w:rPr>
+          <w:rFonts w:ascii="Bookman Old Style" w:hAnsi="Bookman Old Style"/>
+          <w:sz w:val="18"/>
+          <w:szCs w:val="18"/>
+          <w:lang w:val="en-US"/>
+        </w:rPr>
+        <w:t>INSTRUKSI</w:t>
+      </w:r>
+      <w:r>
+        <w:rPr>
+          <w:rFonts w:ascii="Bookman Old Style" w:hAnsi="Bookman Old Style"/>
+          <w:sz w:val="18"/>
+          <w:szCs w:val="18"/>
+          <w:lang w:val="en-US"/>
+        </w:rPr>
+        <w:t>}</w:t>
       </w:r>
     </w:p>
     <w:p>
@@ -778,179 +1210,21 @@
         <w:ind w:left="142" w:right="425"/>
         <w:rPr>
           <w:rFonts w:ascii="Bookman Old Style" w:hAnsi="Bookman Old Style"/>
-          <w:b/>
-          <w:bCs/>
-          <w:lang w:val="en-US"/>
-        </w:rPr>
-      </w:pPr>
-      <w:proofErr w:type="spellStart"/>
-      <w:r>
-        <w:rPr>
-          <w:rFonts w:ascii="Bookman Old Style" w:hAnsi="Bookman Old Style"/>
-          <w:b/>
-          <w:bCs/>
-          <w:lang w:val="en-US"/>
-        </w:rPr>
-        <w:t>Rencana</w:t>
-      </w:r>
-      <w:proofErr w:type="spellEnd"/>
-      <w:r>
-        <w:rPr>
-          <w:rFonts w:ascii="Bookman Old Style" w:hAnsi="Bookman Old Style"/>
-          <w:b/>
-          <w:bCs/>
-          <w:lang w:val="en-US"/>
-        </w:rPr>
-        <w:t xml:space="preserve"> </w:t>
-      </w:r>
-      <w:proofErr w:type="spellStart"/>
-      <w:r>
-        <w:rPr>
-          <w:rFonts w:ascii="Bookman Old Style" w:hAnsi="Bookman Old Style"/>
-          <w:b/>
-          <w:bCs/>
-          <w:lang w:val="en-US"/>
-        </w:rPr>
-        <w:t>Tindak</w:t>
-      </w:r>
-      <w:proofErr w:type="spellEnd"/>
-      <w:r>
-        <w:rPr>
-          <w:rFonts w:ascii="Bookman Old Style" w:hAnsi="Bookman Old Style"/>
-          <w:b/>
-          <w:bCs/>
-          <w:lang w:val="en-US"/>
-        </w:rPr>
-        <w:t xml:space="preserve"> </w:t>
-      </w:r>
-      <w:proofErr w:type="spellStart"/>
-      <w:r>
-        <w:rPr>
-          <w:rFonts w:ascii="Bookman Old Style" w:hAnsi="Bookman Old Style"/>
-          <w:b/>
-          <w:bCs/>
-          <w:lang w:val="en-US"/>
-        </w:rPr>
-        <w:t>Lanjut</w:t>
-      </w:r>
-      <w:proofErr w:type="spellEnd"/>
-      <w:r>
-        <w:rPr>
-          <w:rFonts w:ascii="Bookman Old Style" w:hAnsi="Bookman Old Style"/>
-          <w:b/>
-          <w:bCs/>
-          <w:lang w:val="en-US"/>
-        </w:rPr>
-        <w:t xml:space="preserve"> (</w:t>
-      </w:r>
-      <w:proofErr w:type="spellStart"/>
-      <w:r>
-        <w:rPr>
-          <w:rFonts w:ascii="Bookman Old Style" w:hAnsi="Bookman Old Style"/>
-          <w:b/>
-          <w:bCs/>
-          <w:lang w:val="en-US"/>
-        </w:rPr>
-        <w:t>Evaluasi</w:t>
-      </w:r>
-      <w:proofErr w:type="spellEnd"/>
-      <w:r>
-        <w:rPr>
-          <w:rFonts w:ascii="Bookman Old Style" w:hAnsi="Bookman Old Style"/>
-          <w:b/>
-          <w:bCs/>
-          <w:lang w:val="en-US"/>
-        </w:rPr>
-        <w:t xml:space="preserve"> / </w:t>
-      </w:r>
-      <w:proofErr w:type="spellStart"/>
-      <w:r>
-        <w:rPr>
-          <w:rFonts w:ascii="Bookman Old Style" w:hAnsi="Bookman Old Style"/>
-          <w:b/>
-          <w:bCs/>
-          <w:lang w:val="en-US"/>
-        </w:rPr>
-        <w:t>Rujuk</w:t>
-      </w:r>
-      <w:proofErr w:type="spellEnd"/>
-      <w:r>
-        <w:rPr>
-          <w:rFonts w:ascii="Bookman Old Style" w:hAnsi="Bookman Old Style"/>
-          <w:b/>
-          <w:bCs/>
-          <w:lang w:val="en-US"/>
-        </w:rPr>
-        <w:t xml:space="preserve"> / </w:t>
-      </w:r>
-      <w:proofErr w:type="spellStart"/>
-      <w:r>
-        <w:rPr>
-          <w:rFonts w:ascii="Bookman Old Style" w:hAnsi="Bookman Old Style"/>
-          <w:b/>
-          <w:bCs/>
-          <w:lang w:val="en-US"/>
-        </w:rPr>
-        <w:t>Selesai</w:t>
-      </w:r>
-      <w:proofErr w:type="spellEnd"/>
-      <w:r>
-        <w:rPr>
-          <w:rFonts w:ascii="Bookman Old Style" w:hAnsi="Bookman Old Style"/>
-          <w:b/>
-          <w:bCs/>
-          <w:lang w:val="en-US"/>
-        </w:rPr>
-        <w:t>)</w:t>
-      </w:r>
-    </w:p>
-    <w:p>
-      <w:pPr>
-        <w:pStyle w:val="ListParagraph"/>
-        <w:ind w:left="142" w:right="425"/>
-        <w:rPr>
-          <w:rFonts w:ascii="Bookman Old Style" w:hAnsi="Bookman Old Style"/>
-          <w:lang w:val="en-US"/>
-        </w:rPr>
-      </w:pPr>
-      <w:r>
-        <w:rPr>
-          <w:rFonts w:ascii="Bookman Old Style" w:hAnsi="Bookman Old Style"/>
-          <w:lang w:val="en-US"/>
-        </w:rPr>
-        <w:t>${</w:t>
-      </w:r>
-      <w:r>
-        <w:rPr>
-          <w:rFonts w:ascii="Bookman Old Style" w:hAnsi="Bookman Old Style"/>
-          <w:lang w:val="en-US"/>
-        </w:rPr>
-        <w:t>INSTRUKSI</w:t>
-      </w:r>
-      <w:r>
-        <w:rPr>
-          <w:rFonts w:ascii="Bookman Old Style" w:hAnsi="Bookman Old Style"/>
-          <w:lang w:val="en-US"/>
-        </w:rPr>
-        <w:t>}</w:t>
-      </w:r>
-    </w:p>
-    <w:p>
-      <w:pPr>
-        <w:pStyle w:val="ListParagraph"/>
-        <w:ind w:left="142" w:right="425"/>
-        <w:rPr>
-          <w:rFonts w:ascii="Bookman Old Style" w:hAnsi="Bookman Old Style"/>
-          <w:lang w:val="en-US"/>
-        </w:rPr>
-      </w:pPr>
-    </w:p>
-    <w:p>
-      <w:pPr>
+          <w:sz w:val="10"/>
+          <w:szCs w:val="10"/>
+          <w:lang w:val="en-US"/>
+        </w:rPr>
+      </w:pPr>
+    </w:p>
+    <w:p>
+      <w:pPr>
+        <w:spacing w:after="0"/>
         <w:ind w:left="5812" w:right="425" w:hanging="426"/>
         <w:jc w:val="center"/>
         <w:rPr>
           <w:rFonts w:ascii="Bookman Old Style" w:hAnsi="Bookman Old Style"/>
+          <w:sz w:val="20"/>
+          <w:szCs w:val="20"/>
           <w:lang w:val="en-US"/>
         </w:rPr>
       </w:pPr>
@@ -958,6 +1232,8 @@
       <w:r>
         <w:rPr>
           <w:rFonts w:ascii="Bookman Old Style" w:hAnsi="Bookman Old Style"/>
+          <w:sz w:val="20"/>
+          <w:szCs w:val="20"/>
           <w:lang w:val="en-US"/>
         </w:rPr>
         <w:t>Sukoharjo</w:t>
@@ -966,6 +1242,8 @@
       <w:r>
         <w:rPr>
           <w:rFonts w:ascii="Bookman Old Style" w:hAnsi="Bookman Old Style"/>
+          <w:sz w:val="20"/>
+          <w:szCs w:val="20"/>
           <w:lang w:val="en-US"/>
         </w:rPr>
         <w:t xml:space="preserve">, </w:t>
@@ -973,12 +1251,16 @@
       <w:r>
         <w:rPr>
           <w:rFonts w:ascii="Bookman Old Style" w:hAnsi="Bookman Old Style"/>
+          <w:sz w:val="20"/>
+          <w:szCs w:val="20"/>
         </w:rPr>
         <w:t>${</w:t>
       </w:r>
       <w:r>
         <w:rPr>
           <w:rFonts w:ascii="Bookman Old Style" w:hAnsi="Bookman Old Style"/>
+          <w:sz w:val="20"/>
+          <w:szCs w:val="20"/>
           <w:lang w:val="en-US"/>
         </w:rPr>
         <w:t>TANGGAL</w:t>
@@ -986,6 +1268,8 @@
       <w:r>
         <w:rPr>
           <w:rFonts w:ascii="Bookman Old Style" w:hAnsi="Bookman Old Style"/>
+          <w:sz w:val="20"/>
+          <w:szCs w:val="20"/>
         </w:rPr>
         <w:t>}</w:t>
       </w:r>
@@ -995,12 +1279,14 @@
         <w:ind w:left="5812" w:right="425" w:hanging="426"/>
         <w:rPr>
           <w:rFonts w:ascii="Bookman Old Style" w:hAnsi="Bookman Old Style"/>
+          <w:sz w:val="20"/>
+          <w:szCs w:val="20"/>
           <w:lang w:val="en-US"/>
         </w:rPr>
         <w:sectPr>
           <w:headerReference w:type="default" r:id="rId7"/>
-          <w:pgSz w:w="12191" w:h="18711" w:code="148"/>
-          <w:pgMar w:top="1134" w:right="567" w:bottom="1701" w:left="1134" w:header="284" w:footer="709" w:gutter="0"/>
+          <w:pgSz w:w="12242" w:h="20180" w:code="14"/>
+          <w:pgMar w:top="1134" w:right="567" w:bottom="567" w:left="1134" w:header="284" w:footer="709" w:gutter="0"/>
           <w:cols w:space="708"/>
           <w:docGrid w:linePitch="360"/>
         </w:sectPr>
@@ -1008,16 +1294,21 @@
     </w:p>
     <w:p>
       <w:pPr>
+        <w:spacing w:after="0"/>
         <w:ind w:left="5812" w:right="425" w:hanging="426"/>
         <w:jc w:val="center"/>
         <w:rPr>
           <w:rFonts w:ascii="Bookman Old Style" w:hAnsi="Bookman Old Style"/>
-          <w:lang w:val="en-US"/>
-        </w:rPr>
-      </w:pPr>
-      <w:r>
-        <w:rPr>
-          <w:rFonts w:ascii="Bookman Old Style" w:hAnsi="Bookman Old Style"/>
+          <w:sz w:val="20"/>
+          <w:szCs w:val="20"/>
+          <w:lang w:val="en-US"/>
+        </w:rPr>
+      </w:pPr>
+      <w:r>
+        <w:rPr>
+          <w:rFonts w:ascii="Bookman Old Style" w:hAnsi="Bookman Old Style"/>
+          <w:sz w:val="20"/>
+          <w:szCs w:val="20"/>
           <w:lang w:val="en-US"/>
         </w:rPr>
         <w:t xml:space="preserve">Dokter </w:t>
@@ -1026,6 +1317,8 @@
       <w:r>
         <w:rPr>
           <w:rFonts w:ascii="Bookman Old Style" w:hAnsi="Bookman Old Style"/>
+          <w:sz w:val="20"/>
+          <w:szCs w:val="20"/>
           <w:lang w:val="en-US"/>
         </w:rPr>
         <w:t>Penanggung</w:t>
@@ -1034,6 +1327,8 @@
       <w:r>
         <w:rPr>
           <w:rFonts w:ascii="Bookman Old Style" w:hAnsi="Bookman Old Style"/>
+          <w:sz w:val="20"/>
+          <w:szCs w:val="20"/>
           <w:lang w:val="en-US"/>
         </w:rPr>
         <w:t xml:space="preserve"> Jawab </w:t>
@@ -1042,6 +1337,8 @@
       <w:r>
         <w:rPr>
           <w:rFonts w:ascii="Bookman Old Style" w:hAnsi="Bookman Old Style"/>
+          <w:sz w:val="20"/>
+          <w:szCs w:val="20"/>
           <w:lang w:val="en-US"/>
         </w:rPr>
         <w:t>Pelayanan</w:t>
@@ -1050,16 +1347,21 @@
     </w:p>
     <w:p>
       <w:pPr>
+        <w:spacing w:after="0"/>
         <w:ind w:left="5812" w:right="425" w:hanging="426"/>
         <w:jc w:val="center"/>
         <w:rPr>
           <w:rFonts w:ascii="Bookman Old Style" w:hAnsi="Bookman Old Style"/>
-          <w:lang w:val="en-US"/>
-        </w:rPr>
-      </w:pPr>
-      <w:r>
-        <w:rPr>
-          <w:rFonts w:ascii="Bookman Old Style" w:hAnsi="Bookman Old Style"/>
+          <w:sz w:val="20"/>
+          <w:szCs w:val="20"/>
+          <w:lang w:val="en-US"/>
+        </w:rPr>
+      </w:pPr>
+      <w:r>
+        <w:rPr>
+          <w:rFonts w:ascii="Bookman Old Style" w:hAnsi="Bookman Old Style"/>
+          <w:sz w:val="20"/>
+          <w:szCs w:val="20"/>
           <w:lang w:val="en-US"/>
         </w:rPr>
         <w:t>${PATH_TTE_DOKTER}</w:t>
@@ -1067,24 +1369,21 @@
     </w:p>
     <w:p>
       <w:pPr>
+        <w:spacing w:after="0"/>
         <w:ind w:left="5812" w:right="425" w:hanging="426"/>
         <w:jc w:val="center"/>
         <w:rPr>
           <w:rFonts w:ascii="Bookman Old Style" w:hAnsi="Bookman Old Style"/>
-          <w:lang w:val="en-US"/>
-        </w:rPr>
-        <w:sectPr>
-          <w:type w:val="continuous"/>
-          <w:pgSz w:w="12191" w:h="18711" w:code="148"/>
-          <w:pgMar w:top="1134" w:right="567" w:bottom="1701" w:left="1134" w:header="284" w:footer="709" w:gutter="0"/>
-          <w:cols w:space="708"/>
-          <w:docGrid w:linePitch="360"/>
-        </w:sectPr>
+          <w:sz w:val="20"/>
+          <w:szCs w:val="20"/>
+        </w:rPr>
       </w:pPr>
       <w:proofErr w:type="gramStart"/>
       <w:r>
         <w:rPr>
           <w:rFonts w:ascii="Bookman Old Style" w:hAnsi="Bookman Old Style"/>
+          <w:sz w:val="20"/>
+          <w:szCs w:val="20"/>
           <w:lang w:val="en-US"/>
         </w:rPr>
         <w:t>(</w:t>
@@ -1092,6 +1391,8 @@
       <w:r>
         <w:rPr>
           <w:rFonts w:ascii="Bookman Old Style" w:hAnsi="Bookman Old Style"/>
+          <w:sz w:val="20"/>
+          <w:szCs w:val="20"/>
           <w:lang w:val="en-US"/>
         </w:rPr>
         <w:t xml:space="preserve"> </w:t>
@@ -1099,6 +1400,8 @@
       <w:r>
         <w:rPr>
           <w:rFonts w:ascii="Bookman Old Style" w:hAnsi="Bookman Old Style"/>
+          <w:sz w:val="20"/>
+          <w:szCs w:val="20"/>
         </w:rPr>
         <w:t>$</w:t>
       </w:r>
@@ -1106,41 +1409,25 @@
       <w:r>
         <w:rPr>
           <w:rFonts w:ascii="Bookman Old Style" w:hAnsi="Bookman Old Style"/>
+          <w:sz w:val="20"/>
+          <w:szCs w:val="20"/>
         </w:rPr>
         <w:t>{NAMADOKTER}</w:t>
       </w:r>
       <w:r>
         <w:rPr>
           <w:rFonts w:ascii="Bookman Old Style" w:hAnsi="Bookman Old Style"/>
-          <w:lang w:val="en-US"/>
-        </w:rPr>
-        <w:t xml:space="preserve"> </w:t>
-      </w:r>
-      <w:r>
-        <w:rPr>
-          <w:rFonts w:ascii="Bookman Old Style" w:hAnsi="Bookman Old Style"/>
-          <w:lang w:val="en-US"/>
-        </w:rPr>
-        <w:t>)</w:t>
-      </w:r>
-    </w:p>
-    <w:p>
-      <w:pPr>
-        <w:rPr>
-          <w:rFonts w:ascii="Bookman Old Style" w:hAnsi="Bookman Old Style"/>
-        </w:rPr>
-      </w:pPr>
-      <w:r>
-        <w:rPr>
-          <w:rFonts w:ascii="Bookman Old Style" w:hAnsi="Bookman Old Style"/>
+          <w:sz w:val="20"/>
+          <w:szCs w:val="20"/>
+          <w:lang w:val="en-US"/>
         </w:rPr>
         <w:t xml:space="preserve"> </w:t>
       </w:r>
     </w:p>
     <w:sectPr>
       <w:type w:val="continuous"/>
-      <w:pgSz w:w="12191" w:h="18711" w:code="148"/>
-      <w:pgMar w:top="1134" w:right="567" w:bottom="1701" w:left="1134" w:header="284" w:footer="709" w:gutter="0"/>
+      <w:pgSz w:w="12242" w:h="20180" w:code="14"/>
+      <w:pgMar w:top="1134" w:right="567" w:bottom="567" w:left="1134" w:header="284" w:footer="709" w:gutter="0"/>
       <w:cols w:space="708"/>
       <w:docGrid w:linePitch="360"/>
     </w:sectPr>
@@ -1232,7 +1519,7 @@
           <wp:extent cx="1073426" cy="1073426"/>
           <wp:effectExtent l="0" t="0" r="0" b="0"/>
           <wp:wrapNone/>
-          <wp:docPr id="15" name="Picture 15"/>
+          <wp:docPr id="4" name="Picture 4"/>
           <wp:cNvGraphicFramePr>
             <a:graphicFrameLocks xmlns:a="http://schemas.openxmlformats.org/drawingml/2006/main" noChangeAspect="1"/>
           </wp:cNvGraphicFramePr>

</xml_diff>

<commit_message>
fix bug edit program terapi
</commit_message>
<xml_diff>
--- a/public/doc/input/rehabmedik/cetakNewFormKFR.docx
+++ b/public/doc/input/rehabmedik/cetakNewFormKFR.docx
@@ -1378,7 +1378,6 @@
           <w:szCs w:val="20"/>
         </w:rPr>
       </w:pPr>
-      <w:proofErr w:type="gramStart"/>
       <w:r>
         <w:rPr>
           <w:rFonts w:ascii="Bookman Old Style" w:hAnsi="Bookman Old Style"/>
@@ -1403,16 +1402,7 @@
           <w:sz w:val="20"/>
           <w:szCs w:val="20"/>
         </w:rPr>
-        <w:t>$</w:t>
-      </w:r>
-      <w:proofErr w:type="gramEnd"/>
-      <w:r>
-        <w:rPr>
-          <w:rFonts w:ascii="Bookman Old Style" w:hAnsi="Bookman Old Style"/>
-          <w:sz w:val="20"/>
-          <w:szCs w:val="20"/>
-        </w:rPr>
-        <w:t>{NAMADOKTER}</w:t>
+        <w:t>${NAMADOKTER}</w:t>
       </w:r>
       <w:r>
         <w:rPr>
@@ -1422,6 +1412,15 @@
           <w:lang w:val="en-US"/>
         </w:rPr>
         <w:t xml:space="preserve"> </w:t>
+      </w:r>
+      <w:r>
+        <w:rPr>
+          <w:rFonts w:ascii="Bookman Old Style" w:hAnsi="Bookman Old Style"/>
+          <w:sz w:val="20"/>
+          <w:szCs w:val="20"/>
+          <w:lang w:val="en-US"/>
+        </w:rPr>
+        <w:t>)</w:t>
       </w:r>
     </w:p>
     <w:sectPr>

</xml_diff>

<commit_message>
fix width tte form
</commit_message>
<xml_diff>
--- a/public/doc/input/rehabmedik/cetakNewFormKFR.docx
+++ b/public/doc/input/rehabmedik/cetakNewFormKFR.docx
@@ -1219,7 +1219,7 @@
     <w:p>
       <w:pPr>
         <w:spacing w:after="0"/>
-        <w:ind w:left="5812" w:right="425" w:hanging="426"/>
+        <w:ind w:left="5245" w:right="-91" w:hanging="426"/>
         <w:jc w:val="center"/>
         <w:rPr>
           <w:rFonts w:ascii="Bookman Old Style" w:hAnsi="Bookman Old Style"/>
@@ -1276,7 +1276,7 @@
     </w:p>
     <w:p>
       <w:pPr>
-        <w:ind w:left="5812" w:right="425" w:hanging="426"/>
+        <w:ind w:left="5245" w:right="-91" w:hanging="426"/>
         <w:rPr>
           <w:rFonts w:ascii="Bookman Old Style" w:hAnsi="Bookman Old Style"/>
           <w:sz w:val="20"/>
@@ -1295,7 +1295,7 @@
     <w:p>
       <w:pPr>
         <w:spacing w:after="0"/>
-        <w:ind w:left="5812" w:right="425" w:hanging="426"/>
+        <w:ind w:left="5245" w:right="-91" w:hanging="426"/>
         <w:jc w:val="center"/>
         <w:rPr>
           <w:rFonts w:ascii="Bookman Old Style" w:hAnsi="Bookman Old Style"/>
@@ -1348,7 +1348,7 @@
     <w:p>
       <w:pPr>
         <w:spacing w:after="0"/>
-        <w:ind w:left="5812" w:right="425" w:hanging="426"/>
+        <w:ind w:left="5245" w:right="-91" w:hanging="426"/>
         <w:jc w:val="center"/>
         <w:rPr>
           <w:rFonts w:ascii="Bookman Old Style" w:hAnsi="Bookman Old Style"/>
@@ -1370,7 +1370,7 @@
     <w:p>
       <w:pPr>
         <w:spacing w:after="0"/>
-        <w:ind w:left="5812" w:right="425" w:hanging="426"/>
+        <w:ind w:left="5245" w:right="-91" w:hanging="426"/>
         <w:jc w:val="center"/>
         <w:rPr>
           <w:rFonts w:ascii="Bookman Old Style" w:hAnsi="Bookman Old Style"/>
@@ -1378,6 +1378,7 @@
           <w:szCs w:val="20"/>
         </w:rPr>
       </w:pPr>
+      <w:proofErr w:type="gramStart"/>
       <w:r>
         <w:rPr>
           <w:rFonts w:ascii="Bookman Old Style" w:hAnsi="Bookman Old Style"/>
@@ -1402,7 +1403,16 @@
           <w:sz w:val="20"/>
           <w:szCs w:val="20"/>
         </w:rPr>
-        <w:t>${NAMADOKTER}</w:t>
+        <w:t>$</w:t>
+      </w:r>
+      <w:proofErr w:type="gramEnd"/>
+      <w:r>
+        <w:rPr>
+          <w:rFonts w:ascii="Bookman Old Style" w:hAnsi="Bookman Old Style"/>
+          <w:sz w:val="20"/>
+          <w:szCs w:val="20"/>
+        </w:rPr>
+        <w:t>{NAMADOKTER}</w:t>
       </w:r>
       <w:r>
         <w:rPr>
@@ -1518,7 +1528,7 @@
           <wp:extent cx="1073426" cy="1073426"/>
           <wp:effectExtent l="0" t="0" r="0" b="0"/>
           <wp:wrapNone/>
-          <wp:docPr id="4" name="Picture 4"/>
+          <wp:docPr id="11" name="Picture 11"/>
           <wp:cNvGraphicFramePr>
             <a:graphicFrameLocks xmlns:a="http://schemas.openxmlformats.org/drawingml/2006/main" noChangeAspect="1"/>
           </wp:cNvGraphicFramePr>

</xml_diff>